<commit_message>
Update reserved Zenodo DOI
</commit_message>
<xml_diff>
--- a/paper/manuscript_main.docx
+++ b/paper/manuscript_main.docx
@@ -7549,7 +7549,7 @@
         <w:rPr>
           <w:rFonts w:ascii="Calibri" w:hAnsi="Calibri"/>
         </w:rPr>
-        <w:t>The DeepWeeds source archive is available under CC BY 4.0 from its official repository. Frozen split manifests, hashes, validation reports, raw benchmark observations, final per-sample predictions, and derived tables are included in the accompanying artifact package. Redistribution of source images follows the dataset license. A Zenodo record has been reserved for the reproducibility artifact at https://doi.org/10.5281/zenodo.22080295 and will be made public before manuscript submission.</w:t>
+        <w:t>The DeepWeeds source archive is available under CC BY 4.0 from its official repository. Frozen split manifests, hashes, validation reports, raw benchmark observations, final per-sample predictions, and derived tables are included in the accompanying artifact package. Redistribution of source images follows the dataset license. A Zenodo record has been reserved for the reproducibility artifact at https://doi.org/10.5281/zenodo.22082237 and will be made public before manuscript submission.</w:t>
       </w:r>
     </w:p>
     <w:p>
@@ -7574,7 +7574,7 @@
         <w:rPr>
           <w:rFonts w:ascii="Calibri" w:hAnsi="Calibri"/>
         </w:rPr>
-        <w:t>Training, conversion, parity evaluation, Android benchmarking, locked-test evaluation, statistical analysis, and figure-generation code are included in the reproducibility artifact. Environment reports and SHA-256 provenance records link executed outputs to their source models and data. The reserved artifact DOI is https://doi.org/10.5281/zenodo.22080295; the Zenodo record will be made public before manuscript submission.</w:t>
+        <w:t>Training, conversion, parity evaluation, Android benchmarking, locked-test evaluation, statistical analysis, and figure-generation code are included in the reproducibility artifact. Environment reports and SHA-256 provenance records link executed outputs to their source models and data. The reserved artifact DOI is https://doi.org/10.5281/zenodo.22082237; the Zenodo record will be made public before manuscript submission.</w:t>
       </w:r>
     </w:p>
     <w:p>

</xml_diff>

<commit_message>
Finalize post-publication journal package
</commit_message>
<xml_diff>
--- a/paper/manuscript_main.docx
+++ b/paper/manuscript_main.docx
@@ -188,6 +188,7 @@
     <w:p>
       <w:pPr>
         <w:pStyle w:val="ListNumber"/>
+        <w:keepLines/>
       </w:pPr>
       <w:r>
         <w:rPr>
@@ -212,6 +213,7 @@
     <w:p>
       <w:pPr>
         <w:pStyle w:val="ListNumber"/>
+        <w:keepLines/>
       </w:pPr>
       <w:r>
         <w:rPr>
@@ -236,6 +238,7 @@
     <w:p>
       <w:pPr>
         <w:pStyle w:val="ListNumber"/>
+        <w:keepLines/>
       </w:pPr>
       <w:r>
         <w:rPr>
@@ -260,6 +263,7 @@
     <w:p>
       <w:pPr>
         <w:pStyle w:val="ListNumber"/>
+        <w:keepLines/>
       </w:pPr>
       <w:r>
         <w:rPr>
@@ -7549,7 +7553,7 @@
         <w:rPr>
           <w:rFonts w:ascii="Calibri" w:hAnsi="Calibri"/>
         </w:rPr>
-        <w:t>The DeepWeeds source archive is available under CC BY 4.0 from its official repository. Frozen split manifests, hashes, validation reports, raw benchmark observations, final per-sample predictions, and derived tables are included in the accompanying artifact package. Redistribution of source images follows the dataset license. A Zenodo record has been reserved for the reproducibility artifact at https://doi.org/10.5281/zenodo.22082237 and will be made public before manuscript submission.</w:t>
+        <w:t>The DeepWeeds source archive is available under CC BY 4.0 from its official repository. Frozen split manifests, hashes, validation reports, raw benchmark observations, final per-sample predictions, and derived tables are included in the accompanying artifact package. Redistribution of source images follows the dataset license. The v1.0.0 reproducibility artifact is publicly available on Zenodo at https://doi.org/10.5281/zenodo.22082237.</w:t>
       </w:r>
     </w:p>
     <w:p>
@@ -7574,7 +7578,7 @@
         <w:rPr>
           <w:rFonts w:ascii="Calibri" w:hAnsi="Calibri"/>
         </w:rPr>
-        <w:t>Training, conversion, parity evaluation, Android benchmarking, locked-test evaluation, statistical analysis, and figure-generation code are included in the reproducibility artifact. Environment reports and SHA-256 provenance records link executed outputs to their source models and data. The reserved artifact DOI is https://doi.org/10.5281/zenodo.22082237; the Zenodo record will be made public before manuscript submission.</w:t>
+        <w:t>Training, conversion, parity evaluation, Android benchmarking, locked-test evaluation, statistical analysis, and figure-generation code are included in the reproducibility artifact. Environment reports and SHA-256 provenance records link executed outputs to their source models and data. The v1.0.0 artifact is publicly available at https://doi.org/10.5281/zenodo.22082237, and the source repository is available at https://github.com/akhtarsaleem1/hardware-aware-quantization-android.</w:t>
       </w:r>
     </w:p>
     <w:p>

</xml_diff>